<commit_message>
Align Word docs with CSV list schemas; add change log and doc-update script
Updates the BRD/FDS/TDS, Architecture Pack and Phase 1 Execution Guide so every
list schema matches the CSV source of truth (Projects/Activities/MonthlyReports/
APP_Users columns, DueDate vs DueDayOfMonth, Budget type, Status/Escalated,
Directorates inventory). Adds CHANGES.md documenting all session changes and the
update_docs_schema.py script used for the edits.

Generated with Codebuff 🤖
Co-Authored-By: Codebuff <noreply@codebuff.com>
</commit_message>
<xml_diff>
--- a/APP-MRMS_BRD_FDS_TDS_v2.docx
+++ b/APP-MRMS_BRD_FDS_TDS_v2.docx
@@ -1664,7 +1664,7 @@
                 <w:sz w:val="18"/>
                 <w:szCs w:val="18"/>
               </w:rPr>
-              <w:t>A report cannot be Submitted while in Draft edit unless PlannedAct and ProgressNarrative are both populated.</w:t>
+              <w:t>A report cannot be Submitted while in Draft edit unless PlannedAct and Output are both populated.</w:t>
             </w:r>
           </w:p>
         </w:tc>
@@ -1864,7 +1864,7 @@
                 <w:sz w:val="18"/>
                 <w:szCs w:val="18"/>
               </w:rPr>
-              <w:t>IsOverdue is set when the current date exceeds the Activity's DueDayOfMonth for the current ReportingMonth and Status is not Approved.</w:t>
+              <w:t>IsOverdue is set when the current date exceeds the Activity's DueDate for the current ReportingMonth and Status is not Approved.</w:t>
             </w:r>
           </w:p>
         </w:tc>
@@ -3782,7 +3782,7 @@
                 <w:sz w:val="18"/>
                 <w:szCs w:val="18"/>
               </w:rPr>
-              <w:t>Form to capture PlannedAct, ProgressNarrative, PercentageComplete, and attachment(s) against a selected Activity/ReportingMonth; Save Draft and Submit actions.</w:t>
+              <w:t>Form to capture PlannedAct, Output, PercentageComplete, and attachment(s) against a selected Activity/ReportingMonth; Save Draft and Submit actions.</w:t>
             </w:r>
           </w:p>
         </w:tc>
@@ -6177,7 +6177,7 @@
                 <w:sz w:val="18"/>
                 <w:szCs w:val="18"/>
               </w:rPr>
-              <w:t>Project ID, e.g. "ICTM-PJ-001"</w:t>
+              <w:t>Project ID (Title display name), e.g. "COMM-PJ-002"; unique &amp; indexed</w:t>
             </w:r>
           </w:p>
         </w:tc>
@@ -6206,7 +6206,7 @@
                 <w:sz w:val="18"/>
                 <w:szCs w:val="18"/>
               </w:rPr>
-              <w:t>PriorityChallenge</w:t>
+              <w:t>ProjectCode</w:t>
             </w:r>
           </w:p>
         </w:tc>
@@ -6227,7 +6227,7 @@
                 <w:sz w:val="18"/>
                 <w:szCs w:val="18"/>
               </w:rPr>
-              <w:t>Multiple lines of text</w:t>
+              <w:t>Single line text</w:t>
             </w:r>
           </w:p>
         </w:tc>
@@ -6241,7 +6241,16 @@
               <w:right w:w="80" w:type="dxa"/>
             </w:tcMar>
           </w:tcPr>
-          <w:p/>
+          <w:p>
+            <w:r>
+              <w:rPr>
+                <w:color w:val="000000"/>
+                <w:sz w:val="18"/>
+                <w:szCs w:val="18"/>
+              </w:rPr>
+              <w:t>Optional project code (e.g. "COMM-PJ-002")</w:t>
+            </w:r>
+          </w:p>
         </w:tc>
       </w:tr>
       <w:tr>
@@ -6268,7 +6277,7 @@
                 <w:sz w:val="18"/>
                 <w:szCs w:val="18"/>
               </w:rPr>
-              <w:t>ProjectGoalDescription</w:t>
+              <w:t>PriorityChallenge</w:t>
             </w:r>
           </w:p>
         </w:tc>
@@ -6330,7 +6339,7 @@
                 <w:sz w:val="18"/>
                 <w:szCs w:val="18"/>
               </w:rPr>
-              <w:t>KeyDeliverable</w:t>
+              <w:t>ProjectGoalDescription</w:t>
             </w:r>
           </w:p>
         </w:tc>
@@ -6392,8 +6401,7 @@
                 <w:sz w:val="18"/>
                 <w:szCs w:val="18"/>
               </w:rPr>
-              <w:lastRenderedPageBreak/>
-              <w:t>AnnualTarget</w:t>
+              <w:t>KeyDeliverable</w:t>
             </w:r>
           </w:p>
         </w:tc>
@@ -6428,16 +6436,7 @@
               <w:right w:w="80" w:type="dxa"/>
             </w:tcMar>
           </w:tcPr>
-          <w:p>
-            <w:r>
-              <w:rPr>
-                <w:color w:val="000000"/>
-                <w:sz w:val="18"/>
-                <w:szCs w:val="18"/>
-              </w:rPr>
-              <w:t>Free text target</w:t>
-            </w:r>
-          </w:p>
+          <w:p/>
         </w:tc>
       </w:tr>
       <w:tr>
@@ -6464,7 +6463,8 @@
                 <w:sz w:val="18"/>
                 <w:szCs w:val="18"/>
               </w:rPr>
-              <w:t>Reference</w:t>
+              <w:lastRenderedPageBreak/>
+              <w:t>AnnualTarget</w:t>
             </w:r>
           </w:p>
         </w:tc>
@@ -6485,7 +6485,7 @@
                 <w:sz w:val="18"/>
                 <w:szCs w:val="18"/>
               </w:rPr>
-              <w:t>Single line text</w:t>
+              <w:t>Multiple lines of text</w:t>
             </w:r>
           </w:p>
         </w:tc>
@@ -6506,7 +6506,7 @@
                 <w:sz w:val="18"/>
                 <w:szCs w:val="18"/>
               </w:rPr>
-              <w:t>e.g. "Lekgotla 2025/26"</w:t>
+              <w:t>Free text target</w:t>
             </w:r>
           </w:p>
         </w:tc>
@@ -6535,7 +6535,7 @@
                 <w:sz w:val="18"/>
                 <w:szCs w:val="18"/>
               </w:rPr>
-              <w:t>Budget</w:t>
+              <w:t>Reference</w:t>
             </w:r>
           </w:p>
         </w:tc>
@@ -6556,7 +6556,7 @@
                 <w:sz w:val="18"/>
                 <w:szCs w:val="18"/>
               </w:rPr>
-              <w:t>Currency</w:t>
+              <w:t>Single line text</w:t>
             </w:r>
           </w:p>
         </w:tc>
@@ -6577,7 +6577,7 @@
                 <w:sz w:val="18"/>
                 <w:szCs w:val="18"/>
               </w:rPr>
-              <w:t>ZAR</w:t>
+              <w:t>e.g. "Lekgotla 2025/26"</w:t>
             </w:r>
           </w:p>
         </w:tc>
@@ -6606,7 +6606,7 @@
                 <w:sz w:val="18"/>
                 <w:szCs w:val="18"/>
               </w:rPr>
-              <w:t>Directorate</w:t>
+              <w:t>Budget</w:t>
             </w:r>
           </w:p>
         </w:tc>
@@ -6648,7 +6648,7 @@
                 <w:sz w:val="18"/>
                 <w:szCs w:val="18"/>
               </w:rPr>
-              <w:t>⚠ Text, not Lookup — stores DirectorateID code</w:t>
+              <w:t>Rand value; free-text variants stored as text per live CSV schema</w:t>
             </w:r>
           </w:p>
         </w:tc>
@@ -6677,7 +6677,7 @@
                 <w:sz w:val="18"/>
                 <w:szCs w:val="18"/>
               </w:rPr>
-              <w:t>Programme (+ Programme:ID)</w:t>
+              <w:t>Directorate (+ Directorate: Title)</w:t>
             </w:r>
           </w:p>
         </w:tc>
@@ -6698,7 +6698,7 @@
                 <w:sz w:val="18"/>
                 <w:szCs w:val="18"/>
               </w:rPr>
-              <w:t>Lookup (Programmes)</w:t>
+              <w:t>Lookup (Directorates)</w:t>
             </w:r>
           </w:p>
         </w:tc>
@@ -6719,7 +6719,7 @@
                 <w:sz w:val="18"/>
                 <w:szCs w:val="18"/>
               </w:rPr>
-              <w:t>Correctly a Lookup here, unlike Directorates.Programme</w:t>
+              <w:t>Directorate code; "Directorate: Title" projection shows the full directorate name</w:t>
             </w:r>
           </w:p>
         </w:tc>
@@ -6748,7 +6748,7 @@
                 <w:sz w:val="18"/>
                 <w:szCs w:val="18"/>
               </w:rPr>
-              <w:t>Responsibility</w:t>
+              <w:t>Programme</w:t>
             </w:r>
           </w:p>
         </w:tc>
@@ -6769,7 +6769,7 @@
                 <w:sz w:val="18"/>
                 <w:szCs w:val="18"/>
               </w:rPr>
-              <w:t>Person</w:t>
+              <w:t>Single line text</w:t>
             </w:r>
           </w:p>
         </w:tc>
@@ -6790,7 +6790,7 @@
                 <w:sz w:val="18"/>
                 <w:szCs w:val="18"/>
               </w:rPr>
-              <w:t>Accountable Director/Deputy Director (project owner)</w:t>
+              <w:t>⚠ Text, not a Lookup to Programmes — same pattern as Directorates.Programme</w:t>
             </w:r>
           </w:p>
         </w:tc>
@@ -6819,7 +6819,7 @@
                 <w:sz w:val="18"/>
                 <w:szCs w:val="18"/>
               </w:rPr>
-              <w:t>StartDate / CompletionDate</w:t>
+              <w:t>Responsibility</w:t>
             </w:r>
           </w:p>
         </w:tc>
@@ -6840,7 +6840,7 @@
                 <w:sz w:val="18"/>
                 <w:szCs w:val="18"/>
               </w:rPr>
-              <w:t>Date only</w:t>
+              <w:t>Person</w:t>
             </w:r>
           </w:p>
         </w:tc>
@@ -6854,7 +6854,16 @@
               <w:right w:w="80" w:type="dxa"/>
             </w:tcMar>
           </w:tcPr>
-          <w:p/>
+          <w:p>
+            <w:r>
+              <w:rPr>
+                <w:color w:val="000000"/>
+                <w:sz w:val="18"/>
+                <w:szCs w:val="18"/>
+              </w:rPr>
+              <w:t>Accountable Director/Deputy Director (project owner)</w:t>
+            </w:r>
+          </w:p>
         </w:tc>
       </w:tr>
       <w:tr>
@@ -6881,7 +6890,7 @@
                 <w:sz w:val="18"/>
                 <w:szCs w:val="18"/>
               </w:rPr>
-              <w:t>FinancialYear</w:t>
+              <w:t>StartDate / CompletionDate</w:t>
             </w:r>
           </w:p>
         </w:tc>
@@ -6902,7 +6911,7 @@
                 <w:sz w:val="18"/>
                 <w:szCs w:val="18"/>
               </w:rPr>
-              <w:t>Choice</w:t>
+              <w:t>Date only</w:t>
             </w:r>
           </w:p>
         </w:tc>
@@ -6916,16 +6925,7 @@
               <w:right w:w="80" w:type="dxa"/>
             </w:tcMar>
           </w:tcPr>
-          <w:p>
-            <w:r>
-              <w:rPr>
-                <w:color w:val="000000"/>
-                <w:sz w:val="18"/>
-                <w:szCs w:val="18"/>
-              </w:rPr>
-              <w:t>2022/23 … 2026/27, colour-coded</w:t>
-            </w:r>
-          </w:p>
+          <w:p/>
         </w:tc>
       </w:tr>
       <w:tr>
@@ -6952,6 +6952,77 @@
                 <w:sz w:val="18"/>
                 <w:szCs w:val="18"/>
               </w:rPr>
+              <w:t>FinancialYear</w:t>
+            </w:r>
+          </w:p>
+        </w:tc>
+        <w:tc>
+          <w:tcPr>
+            <w:tcW w:w="1800" w:type="dxa"/>
+            <w:tcMar>
+              <w:top w:w="60" w:type="dxa"/>
+              <w:left w:w="80" w:type="dxa"/>
+              <w:bottom w:w="60" w:type="dxa"/>
+              <w:right w:w="80" w:type="dxa"/>
+            </w:tcMar>
+          </w:tcPr>
+          <w:p>
+            <w:r>
+              <w:rPr>
+                <w:color w:val="000000"/>
+                <w:sz w:val="18"/>
+                <w:szCs w:val="18"/>
+              </w:rPr>
+              <w:t>Choice</w:t>
+            </w:r>
+          </w:p>
+        </w:tc>
+        <w:tc>
+          <w:tcPr>
+            <w:tcW w:w="5800" w:type="dxa"/>
+            <w:tcMar>
+              <w:top w:w="60" w:type="dxa"/>
+              <w:left w:w="80" w:type="dxa"/>
+              <w:bottom w:w="60" w:type="dxa"/>
+              <w:right w:w="80" w:type="dxa"/>
+            </w:tcMar>
+          </w:tcPr>
+          <w:p>
+            <w:r>
+              <w:rPr>
+                <w:color w:val="000000"/>
+                <w:sz w:val="18"/>
+                <w:szCs w:val="18"/>
+              </w:rPr>
+              <w:t>2026/27 … 2022/23, colour-coded</w:t>
+            </w:r>
+          </w:p>
+        </w:tc>
+      </w:tr>
+      <w:tr>
+        <w:tblPrEx>
+          <w:tblCellMar>
+            <w:top w:w="0" w:type="dxa"/>
+            <w:bottom w:w="0" w:type="dxa"/>
+          </w:tblCellMar>
+        </w:tblPrEx>
+        <w:tc>
+          <w:tcPr>
+            <w:tcW w:w="2200" w:type="dxa"/>
+            <w:tcMar>
+              <w:top w:w="60" w:type="dxa"/>
+              <w:left w:w="80" w:type="dxa"/>
+              <w:bottom w:w="60" w:type="dxa"/>
+              <w:right w:w="80" w:type="dxa"/>
+            </w:tcMar>
+          </w:tcPr>
+          <w:p>
+            <w:r>
+              <w:rPr>
+                <w:color w:val="000000"/>
+                <w:sz w:val="18"/>
+                <w:szCs w:val="18"/>
+              </w:rPr>
               <w:t>Status</w:t>
             </w:r>
           </w:p>
@@ -7012,7 +7083,7 @@
           <w:sz w:val="20"/>
           <w:szCs w:val="20"/>
         </w:rPr>
-        <w:t>⚠ Projects.csv and Projects_1.csv exported as identical duplicates — confirm with you whether this is one physical list surfaced twice, or two lists that have since diverged, before any script references "Projects_1".</w:t>
+        <w:t>⚠ ⚠ The live CSV export contains a single Projects list (Projects.csv). There is no separate "Projects_1" list — the earlier duplicate export was a snapshot artefact and should not be referenced.</w:t>
       </w:r>
     </w:p>
     <w:p>
@@ -7223,7 +7294,7 @@
                 <w:sz w:val="18"/>
                 <w:szCs w:val="18"/>
               </w:rPr>
-              <w:t>ActivityDescription</w:t>
+              <w:t>ActivityCode</w:t>
             </w:r>
           </w:p>
         </w:tc>
@@ -7244,7 +7315,7 @@
                 <w:sz w:val="18"/>
                 <w:szCs w:val="18"/>
               </w:rPr>
-              <w:t>Multiple lines of text</w:t>
+              <w:t>Single line text</w:t>
             </w:r>
           </w:p>
         </w:tc>
@@ -7265,7 +7336,7 @@
                 <w:sz w:val="18"/>
                 <w:szCs w:val="18"/>
               </w:rPr>
-              <w:t>Full description</w:t>
+              <w:t>Activity code (e.g. "ICTM-AC-0001"); also carried in Title</w:t>
             </w:r>
           </w:p>
         </w:tc>
@@ -7294,7 +7365,7 @@
                 <w:sz w:val="18"/>
                 <w:szCs w:val="18"/>
               </w:rPr>
-              <w:t>ActivityShortDescription</w:t>
+              <w:t>ActivityDescription</w:t>
             </w:r>
           </w:p>
         </w:tc>
@@ -7315,7 +7386,7 @@
                 <w:sz w:val="18"/>
                 <w:szCs w:val="18"/>
               </w:rPr>
-              <w:t>Single line text</w:t>
+              <w:t>Multiple lines of text</w:t>
             </w:r>
           </w:p>
         </w:tc>
@@ -7336,7 +7407,7 @@
                 <w:sz w:val="18"/>
                 <w:szCs w:val="18"/>
               </w:rPr>
-              <w:t>Denormalized short label for gallery display</w:t>
+              <w:t>Full description</w:t>
             </w:r>
           </w:p>
         </w:tc>
@@ -7365,7 +7436,7 @@
                 <w:sz w:val="18"/>
                 <w:szCs w:val="18"/>
               </w:rPr>
-              <w:t>DirectorateLabel</w:t>
+              <w:t>ActivityShortDescription</w:t>
             </w:r>
           </w:p>
         </w:tc>
@@ -7407,7 +7478,7 @@
                 <w:sz w:val="18"/>
                 <w:szCs w:val="18"/>
               </w:rPr>
-              <w:t>Full directorate name (denormalized)</w:t>
+              <w:t>Denormalized short label for gallery display</w:t>
             </w:r>
           </w:p>
         </w:tc>
@@ -7436,7 +7507,7 @@
                 <w:sz w:val="18"/>
                 <w:szCs w:val="18"/>
               </w:rPr>
-              <w:t>ProgrammeLabel</w:t>
+              <w:t>Directorate</w:t>
             </w:r>
           </w:p>
         </w:tc>
@@ -7478,7 +7549,7 @@
                 <w:sz w:val="18"/>
                 <w:szCs w:val="18"/>
               </w:rPr>
-              <w:t>Programme name (denormalized)</w:t>
+              <w:t>Directorate short code, e.g. "ICT" (matches Directorates.DirectorateID)</w:t>
             </w:r>
           </w:p>
         </w:tc>
@@ -7507,7 +7578,7 @@
                 <w:sz w:val="18"/>
                 <w:szCs w:val="18"/>
               </w:rPr>
-              <w:t>Project</w:t>
+              <w:t>DirectorateLabel</w:t>
             </w:r>
           </w:p>
         </w:tc>
@@ -7528,7 +7599,7 @@
                 <w:sz w:val="18"/>
                 <w:szCs w:val="18"/>
               </w:rPr>
-              <w:t>Lookup (Projects)</w:t>
+              <w:t>Single line text</w:t>
             </w:r>
           </w:p>
         </w:tc>
@@ -7542,7 +7613,16 @@
               <w:right w:w="80" w:type="dxa"/>
             </w:tcMar>
           </w:tcPr>
-          <w:p/>
+          <w:p>
+            <w:r>
+              <w:rPr>
+                <w:color w:val="000000"/>
+                <w:sz w:val="18"/>
+                <w:szCs w:val="18"/>
+              </w:rPr>
+              <w:t>Full directorate name (denormalized)</w:t>
+            </w:r>
+          </w:p>
         </w:tc>
       </w:tr>
       <w:tr>
@@ -7569,7 +7649,7 @@
                 <w:sz w:val="18"/>
                 <w:szCs w:val="18"/>
               </w:rPr>
-              <w:t>Project: Reference</w:t>
+              <w:t>ProgrammeLabel</w:t>
             </w:r>
           </w:p>
         </w:tc>
@@ -7590,7 +7670,7 @@
                 <w:sz w:val="18"/>
                 <w:szCs w:val="18"/>
               </w:rPr>
-              <w:t>Lookup projection</w:t>
+              <w:t>Single line text</w:t>
             </w:r>
           </w:p>
         </w:tc>
@@ -7611,7 +7691,7 @@
                 <w:sz w:val="18"/>
                 <w:szCs w:val="18"/>
               </w:rPr>
-              <w:t>Read-only projected field</w:t>
+              <w:t>Programme name (denormalized)</w:t>
             </w:r>
           </w:p>
         </w:tc>
@@ -7640,7 +7720,7 @@
                 <w:sz w:val="18"/>
                 <w:szCs w:val="18"/>
               </w:rPr>
-              <w:t>Frequency</w:t>
+              <w:t>Project</w:t>
             </w:r>
           </w:p>
         </w:tc>
@@ -7661,7 +7741,7 @@
                 <w:sz w:val="18"/>
                 <w:szCs w:val="18"/>
               </w:rPr>
-              <w:t>Choice</w:t>
+              <w:t>Lookup (Projects)</w:t>
             </w:r>
           </w:p>
         </w:tc>
@@ -7675,16 +7755,7 @@
               <w:right w:w="80" w:type="dxa"/>
             </w:tcMar>
           </w:tcPr>
-          <w:p>
-            <w:r>
-              <w:rPr>
-                <w:color w:val="000000"/>
-                <w:sz w:val="18"/>
-                <w:szCs w:val="18"/>
-              </w:rPr>
-              <w:t>Monthly / Quarterly / Annual, colour-coded</w:t>
-            </w:r>
-          </w:p>
+          <w:p/>
         </w:tc>
       </w:tr>
       <w:tr>
@@ -7711,7 +7782,7 @@
                 <w:sz w:val="18"/>
                 <w:szCs w:val="18"/>
               </w:rPr>
-              <w:t>Owner / ActivityOwner</w:t>
+              <w:t>Project: Reference</w:t>
             </w:r>
           </w:p>
         </w:tc>
@@ -7732,7 +7803,7 @@
                 <w:sz w:val="18"/>
                 <w:szCs w:val="18"/>
               </w:rPr>
-              <w:t>Person</w:t>
+              <w:t>Lookup projection</w:t>
             </w:r>
           </w:p>
         </w:tc>
@@ -7753,7 +7824,7 @@
                 <w:sz w:val="18"/>
                 <w:szCs w:val="18"/>
               </w:rPr>
-              <w:t>Contributor accountable for capture</w:t>
+              <w:t>Read-only projected field</w:t>
             </w:r>
           </w:p>
         </w:tc>
@@ -7782,7 +7853,7 @@
                 <w:sz w:val="18"/>
                 <w:szCs w:val="18"/>
               </w:rPr>
-              <w:t>Supervisor</w:t>
+              <w:t>Frequency</w:t>
             </w:r>
           </w:p>
         </w:tc>
@@ -7803,7 +7874,7 @@
                 <w:sz w:val="18"/>
                 <w:szCs w:val="18"/>
               </w:rPr>
-              <w:t>Person</w:t>
+              <w:t>Choice</w:t>
             </w:r>
           </w:p>
         </w:tc>
@@ -7824,7 +7895,7 @@
                 <w:sz w:val="18"/>
                 <w:szCs w:val="18"/>
               </w:rPr>
-              <w:t>Denormalized from Owner's assignment for fast approval routing</w:t>
+              <w:t>Monthly / Quarterly / Annual, colour-coded</w:t>
             </w:r>
           </w:p>
         </w:tc>
@@ -7853,7 +7924,7 @@
                 <w:sz w:val="18"/>
                 <w:szCs w:val="18"/>
               </w:rPr>
-              <w:t>StartDate / EndDate</w:t>
+              <w:t>Owner</w:t>
             </w:r>
           </w:p>
         </w:tc>
@@ -7874,7 +7945,7 @@
                 <w:sz w:val="18"/>
                 <w:szCs w:val="18"/>
               </w:rPr>
-              <w:t>Date only</w:t>
+              <w:t>Person</w:t>
             </w:r>
           </w:p>
         </w:tc>
@@ -7888,7 +7959,15 @@
               <w:right w:w="80" w:type="dxa"/>
             </w:tcMar>
           </w:tcPr>
-          <w:p/>
+          <w:p>
+            <w:r>
+              <w:rPr>
+                <w:color w:val="000000"/>
+                <w:sz w:val="18"/>
+                <w:szCs w:val="18"/>
+              </w:rPr>
+            </w:r>
+          </w:p>
         </w:tc>
       </w:tr>
       <w:tr>
@@ -7915,7 +7994,7 @@
                 <w:sz w:val="18"/>
                 <w:szCs w:val="18"/>
               </w:rPr>
-              <w:t>DueDayOfMonth</w:t>
+              <w:t>ActivityOwner</w:t>
             </w:r>
           </w:p>
         </w:tc>
@@ -7936,7 +8015,7 @@
                 <w:sz w:val="18"/>
                 <w:szCs w:val="18"/>
               </w:rPr>
-              <w:t>Number</w:t>
+              <w:t>Person</w:t>
             </w:r>
           </w:p>
         </w:tc>
@@ -7957,7 +8036,7 @@
                 <w:sz w:val="18"/>
                 <w:szCs w:val="18"/>
               </w:rPr>
-              <w:t>Used by reminder/escalation flows</w:t>
+              <w:t>Contributor accountable for capture (separate 'ActivityOwner' column)</w:t>
             </w:r>
           </w:p>
         </w:tc>
@@ -7986,6 +8065,210 @@
                 <w:sz w:val="18"/>
                 <w:szCs w:val="18"/>
               </w:rPr>
+              <w:t>Supervisor</w:t>
+            </w:r>
+          </w:p>
+        </w:tc>
+        <w:tc>
+          <w:tcPr>
+            <w:tcW w:w="1800" w:type="dxa"/>
+            <w:tcMar>
+              <w:top w:w="60" w:type="dxa"/>
+              <w:left w:w="80" w:type="dxa"/>
+              <w:bottom w:w="60" w:type="dxa"/>
+              <w:right w:w="80" w:type="dxa"/>
+            </w:tcMar>
+          </w:tcPr>
+          <w:p>
+            <w:r>
+              <w:rPr>
+                <w:color w:val="000000"/>
+                <w:sz w:val="18"/>
+                <w:szCs w:val="18"/>
+              </w:rPr>
+              <w:t>Person</w:t>
+            </w:r>
+          </w:p>
+        </w:tc>
+        <w:tc>
+          <w:tcPr>
+            <w:tcW w:w="5800" w:type="dxa"/>
+            <w:tcMar>
+              <w:top w:w="60" w:type="dxa"/>
+              <w:left w:w="80" w:type="dxa"/>
+              <w:bottom w:w="60" w:type="dxa"/>
+              <w:right w:w="80" w:type="dxa"/>
+            </w:tcMar>
+          </w:tcPr>
+          <w:p>
+            <w:r>
+              <w:rPr>
+                <w:color w:val="000000"/>
+                <w:sz w:val="18"/>
+                <w:szCs w:val="18"/>
+              </w:rPr>
+              <w:t>Denormalized from Owner's assignment for fast approval routing</w:t>
+            </w:r>
+          </w:p>
+        </w:tc>
+      </w:tr>
+      <w:tr>
+        <w:tblPrEx>
+          <w:tblCellMar>
+            <w:top w:w="0" w:type="dxa"/>
+            <w:bottom w:w="0" w:type="dxa"/>
+          </w:tblCellMar>
+        </w:tblPrEx>
+        <w:tc>
+          <w:tcPr>
+            <w:tcW w:w="2200" w:type="dxa"/>
+            <w:tcMar>
+              <w:top w:w="60" w:type="dxa"/>
+              <w:left w:w="80" w:type="dxa"/>
+              <w:bottom w:w="60" w:type="dxa"/>
+              <w:right w:w="80" w:type="dxa"/>
+            </w:tcMar>
+          </w:tcPr>
+          <w:p>
+            <w:r>
+              <w:rPr>
+                <w:color w:val="000000"/>
+                <w:sz w:val="18"/>
+                <w:szCs w:val="18"/>
+              </w:rPr>
+              <w:t>StartDate / EndDate</w:t>
+            </w:r>
+          </w:p>
+        </w:tc>
+        <w:tc>
+          <w:tcPr>
+            <w:tcW w:w="1800" w:type="dxa"/>
+            <w:tcMar>
+              <w:top w:w="60" w:type="dxa"/>
+              <w:left w:w="80" w:type="dxa"/>
+              <w:bottom w:w="60" w:type="dxa"/>
+              <w:right w:w="80" w:type="dxa"/>
+            </w:tcMar>
+          </w:tcPr>
+          <w:p>
+            <w:r>
+              <w:rPr>
+                <w:color w:val="000000"/>
+                <w:sz w:val="18"/>
+                <w:szCs w:val="18"/>
+              </w:rPr>
+              <w:t>Date only</w:t>
+            </w:r>
+          </w:p>
+        </w:tc>
+        <w:tc>
+          <w:tcPr>
+            <w:tcW w:w="5800" w:type="dxa"/>
+            <w:tcMar>
+              <w:top w:w="60" w:type="dxa"/>
+              <w:left w:w="80" w:type="dxa"/>
+              <w:bottom w:w="60" w:type="dxa"/>
+              <w:right w:w="80" w:type="dxa"/>
+            </w:tcMar>
+          </w:tcPr>
+          <w:p/>
+        </w:tc>
+      </w:tr>
+      <w:tr>
+        <w:tblPrEx>
+          <w:tblCellMar>
+            <w:top w:w="0" w:type="dxa"/>
+            <w:bottom w:w="0" w:type="dxa"/>
+          </w:tblCellMar>
+        </w:tblPrEx>
+        <w:tc>
+          <w:tcPr>
+            <w:tcW w:w="2200" w:type="dxa"/>
+            <w:tcMar>
+              <w:top w:w="60" w:type="dxa"/>
+              <w:left w:w="80" w:type="dxa"/>
+              <w:bottom w:w="60" w:type="dxa"/>
+              <w:right w:w="80" w:type="dxa"/>
+            </w:tcMar>
+          </w:tcPr>
+          <w:p>
+            <w:r>
+              <w:rPr>
+                <w:color w:val="000000"/>
+                <w:sz w:val="18"/>
+                <w:szCs w:val="18"/>
+              </w:rPr>
+              <w:t>DueDate</w:t>
+            </w:r>
+          </w:p>
+        </w:tc>
+        <w:tc>
+          <w:tcPr>
+            <w:tcW w:w="1800" w:type="dxa"/>
+            <w:tcMar>
+              <w:top w:w="60" w:type="dxa"/>
+              <w:left w:w="80" w:type="dxa"/>
+              <w:bottom w:w="60" w:type="dxa"/>
+              <w:right w:w="80" w:type="dxa"/>
+            </w:tcMar>
+          </w:tcPr>
+          <w:p>
+            <w:r>
+              <w:rPr>
+                <w:color w:val="000000"/>
+                <w:sz w:val="18"/>
+                <w:szCs w:val="18"/>
+              </w:rPr>
+              <w:t>Date only</w:t>
+            </w:r>
+          </w:p>
+        </w:tc>
+        <w:tc>
+          <w:tcPr>
+            <w:tcW w:w="5800" w:type="dxa"/>
+            <w:tcMar>
+              <w:top w:w="60" w:type="dxa"/>
+              <w:left w:w="80" w:type="dxa"/>
+              <w:bottom w:w="60" w:type="dxa"/>
+              <w:right w:w="80" w:type="dxa"/>
+            </w:tcMar>
+          </w:tcPr>
+          <w:p>
+            <w:r>
+              <w:rPr>
+                <w:color w:val="000000"/>
+                <w:sz w:val="18"/>
+                <w:szCs w:val="18"/>
+              </w:rPr>
+              <w:t>Report due date (EndDate + 3 days in current data)</w:t>
+            </w:r>
+          </w:p>
+        </w:tc>
+      </w:tr>
+      <w:tr>
+        <w:tblPrEx>
+          <w:tblCellMar>
+            <w:top w:w="0" w:type="dxa"/>
+            <w:bottom w:w="0" w:type="dxa"/>
+          </w:tblCellMar>
+        </w:tblPrEx>
+        <w:tc>
+          <w:tcPr>
+            <w:tcW w:w="2200" w:type="dxa"/>
+            <w:tcMar>
+              <w:top w:w="60" w:type="dxa"/>
+              <w:left w:w="80" w:type="dxa"/>
+              <w:bottom w:w="60" w:type="dxa"/>
+              <w:right w:w="80" w:type="dxa"/>
+            </w:tcMar>
+          </w:tcPr>
+          <w:p>
+            <w:r>
+              <w:rPr>
+                <w:color w:val="000000"/>
+                <w:sz w:val="18"/>
+                <w:szCs w:val="18"/>
+              </w:rPr>
               <w:t>Active</w:t>
             </w:r>
           </w:p>
@@ -8029,6 +8312,77 @@
                 <w:szCs w:val="18"/>
               </w:rPr>
               <w:t>Default = true</w:t>
+            </w:r>
+          </w:p>
+        </w:tc>
+      </w:tr>
+      <w:tr>
+        <w:tblPrEx>
+          <w:tblCellMar>
+            <w:top w:w="0" w:type="dxa"/>
+            <w:bottom w:w="0" w:type="dxa"/>
+          </w:tblCellMar>
+        </w:tblPrEx>
+        <w:tc>
+          <w:tcPr>
+            <w:tcW w:w="2200" w:type="dxa"/>
+            <w:tcMar>
+              <w:top w:w="60" w:type="dxa"/>
+              <w:left w:w="80" w:type="dxa"/>
+              <w:bottom w:w="60" w:type="dxa"/>
+              <w:right w:w="80" w:type="dxa"/>
+            </w:tcMar>
+          </w:tcPr>
+          <w:p>
+            <w:r>
+              <w:rPr>
+                <w:color w:val="000000"/>
+                <w:sz w:val="18"/>
+                <w:szCs w:val="18"/>
+              </w:rPr>
+              <w:t>Status</w:t>
+            </w:r>
+          </w:p>
+        </w:tc>
+        <w:tc>
+          <w:tcPr>
+            <w:tcW w:w="1800" w:type="dxa"/>
+            <w:tcMar>
+              <w:top w:w="60" w:type="dxa"/>
+              <w:left w:w="80" w:type="dxa"/>
+              <w:bottom w:w="60" w:type="dxa"/>
+              <w:right w:w="80" w:type="dxa"/>
+            </w:tcMar>
+          </w:tcPr>
+          <w:p>
+            <w:r>
+              <w:rPr>
+                <w:color w:val="000000"/>
+                <w:sz w:val="18"/>
+                <w:szCs w:val="18"/>
+              </w:rPr>
+              <w:t>Choice</w:t>
+            </w:r>
+          </w:p>
+        </w:tc>
+        <w:tc>
+          <w:tcPr>
+            <w:tcW w:w="5800" w:type="dxa"/>
+            <w:tcMar>
+              <w:top w:w="60" w:type="dxa"/>
+              <w:left w:w="80" w:type="dxa"/>
+              <w:bottom w:w="60" w:type="dxa"/>
+              <w:right w:w="80" w:type="dxa"/>
+            </w:tcMar>
+          </w:tcPr>
+          <w:p>
+            <w:r>
+              <w:rPr>
+                <w:color w:val="000000"/>
+                <w:sz w:val="18"/>
+                <w:szCs w:val="18"/>
+              </w:rPr>
+              <w:t>Active / Completed / Not Started, colour-coded</w:t>
             </w:r>
           </w:p>
         </w:tc>
@@ -8497,7 +8851,7 @@
                 <w:sz w:val="18"/>
                 <w:szCs w:val="18"/>
               </w:rPr>
-              <w:t>Plus read-only Activity: ActivityShortDescription / StartDate / EndDate / DueDayOfMonth projections</w:t>
+              <w:t>Plus read-only Activity: ActivityShortDescription / StartDate / EndDate / DueDate projections</w:t>
             </w:r>
           </w:p>
         </w:tc>
@@ -8597,7 +8951,6 @@
                 <w:sz w:val="18"/>
                 <w:szCs w:val="18"/>
               </w:rPr>
-              <w:lastRenderedPageBreak/>
               <w:t>Quarter</w:t>
             </w:r>
           </w:p>
@@ -8640,7 +8993,7 @@
                 <w:sz w:val="18"/>
                 <w:szCs w:val="18"/>
               </w:rPr>
-              <w:t>Q1–Q4</w:t>
+              <w:t>Q1–Q4 (+ All)</w:t>
             </w:r>
           </w:p>
         </w:tc>
@@ -8802,7 +9155,7 @@
                 <w:sz w:val="18"/>
                 <w:szCs w:val="18"/>
               </w:rPr>
-              <w:t>ProgressNarrative</w:t>
+              <w:t>ReasonForDeviation</w:t>
             </w:r>
           </w:p>
         </w:tc>
@@ -8837,7 +9190,11 @@
               <w:right w:w="80" w:type="dxa"/>
             </w:tcMar>
           </w:tcPr>
-          <w:p/>
+          <w:p>
+            <w:r>
+              <w:t>Free-text reason when progress deviates from plan</w:t>
+            </w:r>
+          </w:p>
         </w:tc>
       </w:tr>
       <w:tr>
@@ -8864,7 +9221,7 @@
                 <w:sz w:val="18"/>
                 <w:szCs w:val="18"/>
               </w:rPr>
-              <w:t>PercentageComplete</w:t>
+              <w:t>RemedialAction</w:t>
             </w:r>
           </w:p>
         </w:tc>
@@ -8885,7 +9242,7 @@
                 <w:sz w:val="18"/>
                 <w:szCs w:val="18"/>
               </w:rPr>
-              <w:t>Number</w:t>
+              <w:t>Multiple lines of text</w:t>
             </w:r>
           </w:p>
         </w:tc>
@@ -8899,7 +9256,11 @@
               <w:right w:w="80" w:type="dxa"/>
             </w:tcMar>
           </w:tcPr>
-          <w:p/>
+          <w:p>
+            <w:r>
+              <w:t>Corrective action taken/planned</w:t>
+            </w:r>
+          </w:p>
         </w:tc>
       </w:tr>
       <w:tr>
@@ -8926,6 +9287,134 @@
                 <w:sz w:val="18"/>
                 <w:szCs w:val="18"/>
               </w:rPr>
+              <w:t>Output</w:t>
+            </w:r>
+          </w:p>
+        </w:tc>
+        <w:tc>
+          <w:tcPr>
+            <w:tcW w:w="1600" w:type="dxa"/>
+            <w:tcMar>
+              <w:top w:w="60" w:type="dxa"/>
+              <w:left w:w="80" w:type="dxa"/>
+              <w:bottom w:w="60" w:type="dxa"/>
+              <w:right w:w="80" w:type="dxa"/>
+            </w:tcMar>
+          </w:tcPr>
+          <w:p>
+            <w:r>
+              <w:rPr>
+                <w:color w:val="000000"/>
+                <w:sz w:val="18"/>
+                <w:szCs w:val="18"/>
+              </w:rPr>
+              <w:t>Multiple lines of text</w:t>
+            </w:r>
+          </w:p>
+        </w:tc>
+        <w:tc>
+          <w:tcPr>
+            <w:tcW w:w="5800" w:type="dxa"/>
+            <w:tcMar>
+              <w:top w:w="60" w:type="dxa"/>
+              <w:left w:w="80" w:type="dxa"/>
+              <w:bottom w:w="60" w:type="dxa"/>
+              <w:right w:w="80" w:type="dxa"/>
+            </w:tcMar>
+          </w:tcPr>
+          <w:p>
+            <w:r>
+              <w:t>Reported output / achievement narrative</w:t>
+            </w:r>
+          </w:p>
+        </w:tc>
+      </w:tr>
+      <w:tr>
+        <w:tblPrEx>
+          <w:tblCellMar>
+            <w:top w:w="0" w:type="dxa"/>
+            <w:bottom w:w="0" w:type="dxa"/>
+          </w:tblCellMar>
+        </w:tblPrEx>
+        <w:tc>
+          <w:tcPr>
+            <w:tcW w:w="2400" w:type="dxa"/>
+            <w:tcMar>
+              <w:top w:w="60" w:type="dxa"/>
+              <w:left w:w="80" w:type="dxa"/>
+              <w:bottom w:w="60" w:type="dxa"/>
+              <w:right w:w="80" w:type="dxa"/>
+            </w:tcMar>
+          </w:tcPr>
+          <w:p>
+            <w:r>
+              <w:rPr>
+                <w:color w:val="000000"/>
+                <w:sz w:val="18"/>
+                <w:szCs w:val="18"/>
+              </w:rPr>
+              <w:t>PercentageComplete</w:t>
+            </w:r>
+          </w:p>
+        </w:tc>
+        <w:tc>
+          <w:tcPr>
+            <w:tcW w:w="1600" w:type="dxa"/>
+            <w:tcMar>
+              <w:top w:w="60" w:type="dxa"/>
+              <w:left w:w="80" w:type="dxa"/>
+              <w:bottom w:w="60" w:type="dxa"/>
+              <w:right w:w="80" w:type="dxa"/>
+            </w:tcMar>
+          </w:tcPr>
+          <w:p>
+            <w:r>
+              <w:rPr>
+                <w:color w:val="000000"/>
+                <w:sz w:val="18"/>
+                <w:szCs w:val="18"/>
+              </w:rPr>
+              <w:t>Number</w:t>
+            </w:r>
+          </w:p>
+        </w:tc>
+        <w:tc>
+          <w:tcPr>
+            <w:tcW w:w="5800" w:type="dxa"/>
+            <w:tcMar>
+              <w:top w:w="60" w:type="dxa"/>
+              <w:left w:w="80" w:type="dxa"/>
+              <w:bottom w:w="60" w:type="dxa"/>
+              <w:right w:w="80" w:type="dxa"/>
+            </w:tcMar>
+          </w:tcPr>
+          <w:p/>
+        </w:tc>
+      </w:tr>
+      <w:tr>
+        <w:tblPrEx>
+          <w:tblCellMar>
+            <w:top w:w="0" w:type="dxa"/>
+            <w:bottom w:w="0" w:type="dxa"/>
+          </w:tblCellMar>
+        </w:tblPrEx>
+        <w:tc>
+          <w:tcPr>
+            <w:tcW w:w="2400" w:type="dxa"/>
+            <w:tcMar>
+              <w:top w:w="60" w:type="dxa"/>
+              <w:left w:w="80" w:type="dxa"/>
+              <w:bottom w:w="60" w:type="dxa"/>
+              <w:right w:w="80" w:type="dxa"/>
+            </w:tcMar>
+          </w:tcPr>
+          <w:p>
+            <w:r>
+              <w:rPr>
+                <w:color w:val="000000"/>
+                <w:sz w:val="18"/>
+                <w:szCs w:val="18"/>
+              </w:rPr>
               <w:t>Status</w:t>
             </w:r>
           </w:p>
@@ -8968,7 +9457,7 @@
                 <w:sz w:val="18"/>
                 <w:szCs w:val="18"/>
               </w:rPr>
-              <w:t>Draft / Submitted / Approved / Rejected</w:t>
+              <w:t>Draft / Submitted / Approved / Rejected / Escalated</w:t>
             </w:r>
           </w:p>
         </w:tc>
@@ -11943,406 +12432,90 @@
           <w:szCs w:val="18"/>
         </w:rPr>
         <w:t>// Submit (scr_ReportSubmission, btnSubmit.OnSelect)</w:t>
-      </w:r>
-      <w:r>
-        <w:rPr>
-          <w:rFonts w:ascii="Consolas" w:eastAsia="Consolas" w:hAnsi="Consolas" w:cs="Consolas"/>
-          <w:sz w:val="18"/>
-          <w:szCs w:val="18"/>
-        </w:rPr>
         <w:br/>
         <w:t>Patch(</w:t>
-      </w:r>
-      <w:r>
-        <w:rPr>
-          <w:rFonts w:ascii="Consolas" w:eastAsia="Consolas" w:hAnsi="Consolas" w:cs="Consolas"/>
-          <w:sz w:val="18"/>
-          <w:szCs w:val="18"/>
-        </w:rPr>
         <w:br/>
         <w:t xml:space="preserve">    MonthlyReports,</w:t>
-      </w:r>
-      <w:r>
-        <w:rPr>
-          <w:rFonts w:ascii="Consolas" w:eastAsia="Consolas" w:hAnsi="Consolas" w:cs="Consolas"/>
-          <w:sz w:val="18"/>
-          <w:szCs w:val="18"/>
-        </w:rPr>
         <w:br/>
         <w:t xml:space="preserve">    varMode = "New" ? Defaults(MonthlyReports) : varEditingReport,</w:t>
-      </w:r>
-      <w:r>
-        <w:rPr>
-          <w:rFonts w:ascii="Consolas" w:eastAsia="Consolas" w:hAnsi="Consolas" w:cs="Consolas"/>
-          <w:sz w:val="18"/>
-          <w:szCs w:val="18"/>
-        </w:rPr>
         <w:br/>
         <w:t xml:space="preserve">    {</w:t>
-      </w:r>
-      <w:r>
-        <w:rPr>
-          <w:rFonts w:ascii="Consolas" w:eastAsia="Consolas" w:hAnsi="Consolas" w:cs="Consolas"/>
-          <w:sz w:val="18"/>
-          <w:szCs w:val="18"/>
-        </w:rPr>
         <w:br/>
         <w:t xml:space="preserve">        Activity: varSelectedActivity,</w:t>
-      </w:r>
-      <w:r>
-        <w:rPr>
-          <w:rFonts w:ascii="Consolas" w:eastAsia="Consolas" w:hAnsi="Consolas" w:cs="Consolas"/>
-          <w:sz w:val="18"/>
-          <w:szCs w:val="18"/>
-        </w:rPr>
         <w:br/>
         <w:t xml:space="preserve">        DirectorateLabel: varSelectedActivity.DirectorateLabel,</w:t>
-      </w:r>
-      <w:r>
-        <w:rPr>
-          <w:rFonts w:ascii="Consolas" w:eastAsia="Consolas" w:hAnsi="Consolas" w:cs="Consolas"/>
-          <w:sz w:val="18"/>
-          <w:szCs w:val="18"/>
-        </w:rPr>
         <w:br/>
         <w:t xml:space="preserve">        ProgrammeLabel: varSelectedActivity.ProgrammeLabel,</w:t>
-      </w:r>
-      <w:r>
-        <w:rPr>
-          <w:rFonts w:ascii="Consolas" w:eastAsia="Consolas" w:hAnsi="Consolas" w:cs="Consolas"/>
-          <w:sz w:val="18"/>
-          <w:szCs w:val="18"/>
-        </w:rPr>
         <w:br/>
         <w:t xml:space="preserve">        ActivityOwnerLabel: User().FullName,</w:t>
-      </w:r>
-      <w:r>
-        <w:rPr>
-          <w:rFonts w:ascii="Consolas" w:eastAsia="Consolas" w:hAnsi="Consolas" w:cs="Consolas"/>
-          <w:sz w:val="18"/>
-          <w:szCs w:val="18"/>
-        </w:rPr>
         <w:br/>
         <w:t xml:space="preserve">        PlannedAct: txtPlannedAct.Text,</w:t>
-      </w:r>
-      <w:r>
-        <w:rPr>
-          <w:rFonts w:ascii="Consolas" w:eastAsia="Consolas" w:hAnsi="Consolas" w:cs="Consolas"/>
-          <w:sz w:val="18"/>
-          <w:szCs w:val="18"/>
-        </w:rPr>
-        <w:br/>
-        <w:t xml:space="preserve">        ProgressNarrative: txtProgress.Text,</w:t>
-      </w:r>
-      <w:r>
-        <w:rPr>
-          <w:rFonts w:ascii="Consolas" w:eastAsia="Consolas" w:hAnsi="Consolas" w:cs="Consolas"/>
-          <w:sz w:val="18"/>
-          <w:szCs w:val="18"/>
-        </w:rPr>
+        <w:br/>
+        <w:t xml:space="preserve">        Output: txtProgress.Text,</w:t>
         <w:br/>
         <w:t xml:space="preserve">        PercentageComplete: Value(sldPercent.Value),</w:t>
-      </w:r>
-      <w:r>
-        <w:rPr>
-          <w:rFonts w:ascii="Consolas" w:eastAsia="Consolas" w:hAnsi="Consolas" w:cs="Consolas"/>
-          <w:sz w:val="18"/>
-          <w:szCs w:val="18"/>
-        </w:rPr>
         <w:br/>
         <w:t xml:space="preserve">        Status: { Value: "Submitted" },</w:t>
-      </w:r>
-      <w:r>
-        <w:rPr>
-          <w:rFonts w:ascii="Consolas" w:eastAsia="Consolas" w:hAnsi="Consolas" w:cs="Consolas"/>
-          <w:sz w:val="18"/>
-          <w:szCs w:val="18"/>
-        </w:rPr>
         <w:br/>
         <w:t xml:space="preserve">        SubmittedBy: { '@odata.type':"#Microsoft.Azure.Connectors.SharePoint.SPListExpandedUser", Claims:"i:0#.f|membership|" &amp; User().Email, DisplayName: User().FullName, Email: User().Email },</w:t>
-      </w:r>
-      <w:r>
-        <w:rPr>
-          <w:rFonts w:ascii="Consolas" w:eastAsia="Consolas" w:hAnsi="Consolas" w:cs="Consolas"/>
-          <w:sz w:val="18"/>
-          <w:szCs w:val="18"/>
-        </w:rPr>
         <w:br/>
         <w:t xml:space="preserve">        SubmissionDate: Now(),</w:t>
-      </w:r>
-      <w:r>
-        <w:rPr>
-          <w:rFonts w:ascii="Consolas" w:eastAsia="Consolas" w:hAnsi="Consolas" w:cs="Consolas"/>
-          <w:sz w:val="18"/>
-          <w:szCs w:val="18"/>
-        </w:rPr>
         <w:br/>
         <w:t xml:space="preserve">        Version: varMode = "New" ? 1 : varEditingReport.Version + 1</w:t>
-      </w:r>
-      <w:r>
-        <w:rPr>
-          <w:rFonts w:ascii="Consolas" w:eastAsia="Consolas" w:hAnsi="Consolas" w:cs="Consolas"/>
-          <w:sz w:val="18"/>
-          <w:szCs w:val="18"/>
-        </w:rPr>
         <w:br/>
         <w:t xml:space="preserve">    }</w:t>
-      </w:r>
-      <w:r>
-        <w:rPr>
-          <w:rFonts w:ascii="Consolas" w:eastAsia="Consolas" w:hAnsi="Consolas" w:cs="Consolas"/>
-          <w:sz w:val="18"/>
-          <w:szCs w:val="18"/>
-        </w:rPr>
         <w:br/>
         <w:t>);</w:t>
-      </w:r>
-      <w:r>
-        <w:rPr>
-          <w:rFonts w:ascii="Consolas" w:eastAsia="Consolas" w:hAnsi="Consolas" w:cs="Consolas"/>
-          <w:sz w:val="18"/>
-          <w:szCs w:val="18"/>
-        </w:rPr>
-        <w:br/>
-      </w:r>
-      <w:r>
-        <w:rPr>
-          <w:rFonts w:ascii="Consolas" w:eastAsia="Consolas" w:hAnsi="Consolas" w:cs="Consolas"/>
-          <w:sz w:val="18"/>
-          <w:szCs w:val="18"/>
-        </w:rPr>
+        <w:br/>
         <w:br/>
         <w:t>// Approve (scr_ApprovalQueue, btnApprove.OnSelect)</w:t>
-      </w:r>
-      <w:r>
-        <w:rPr>
-          <w:rFonts w:ascii="Consolas" w:eastAsia="Consolas" w:hAnsi="Consolas" w:cs="Consolas"/>
-          <w:sz w:val="18"/>
-          <w:szCs w:val="18"/>
-        </w:rPr>
         <w:br/>
         <w:t>Patch(</w:t>
-      </w:r>
-      <w:r>
-        <w:rPr>
-          <w:rFonts w:ascii="Consolas" w:eastAsia="Consolas" w:hAnsi="Consolas" w:cs="Consolas"/>
-          <w:sz w:val="18"/>
-          <w:szCs w:val="18"/>
-        </w:rPr>
         <w:br/>
         <w:t xml:space="preserve">    MonthlyReports,</w:t>
-      </w:r>
-      <w:r>
-        <w:rPr>
-          <w:rFonts w:ascii="Consolas" w:eastAsia="Consolas" w:hAnsi="Consolas" w:cs="Consolas"/>
-          <w:sz w:val="18"/>
-          <w:szCs w:val="18"/>
-        </w:rPr>
         <w:br/>
         <w:t xml:space="preserve">    ThisItem,</w:t>
-      </w:r>
-      <w:r>
-        <w:rPr>
-          <w:rFonts w:ascii="Consolas" w:eastAsia="Consolas" w:hAnsi="Consolas" w:cs="Consolas"/>
-          <w:sz w:val="18"/>
-          <w:szCs w:val="18"/>
-        </w:rPr>
         <w:br/>
         <w:t xml:space="preserve">    {</w:t>
-      </w:r>
-      <w:r>
-        <w:rPr>
-          <w:rFonts w:ascii="Consolas" w:eastAsia="Consolas" w:hAnsi="Consolas" w:cs="Consolas"/>
-          <w:sz w:val="18"/>
-          <w:szCs w:val="18"/>
-        </w:rPr>
         <w:br/>
         <w:t xml:space="preserve">        Status: { Value: "Approved" },</w:t>
-      </w:r>
-      <w:r>
-        <w:rPr>
-          <w:rFonts w:ascii="Consolas" w:eastAsia="Consolas" w:hAnsi="Consolas" w:cs="Consolas"/>
-          <w:sz w:val="18"/>
-          <w:szCs w:val="18"/>
-        </w:rPr>
         <w:br/>
         <w:t xml:space="preserve">        ReviewedBy: { DisplayName: User().FullName, Email: User().Email },</w:t>
-      </w:r>
-      <w:r>
-        <w:rPr>
-          <w:rFonts w:ascii="Consolas" w:eastAsia="Consolas" w:hAnsi="Consolas" w:cs="Consolas"/>
-          <w:sz w:val="18"/>
-          <w:szCs w:val="18"/>
-        </w:rPr>
         <w:br/>
         <w:t xml:space="preserve">        ReviewDate: Now()</w:t>
-      </w:r>
-      <w:r>
-        <w:rPr>
-          <w:rFonts w:ascii="Consolas" w:eastAsia="Consolas" w:hAnsi="Consolas" w:cs="Consolas"/>
-          <w:sz w:val="18"/>
-          <w:szCs w:val="18"/>
-        </w:rPr>
         <w:br/>
         <w:t xml:space="preserve">    }</w:t>
-      </w:r>
-      <w:r>
-        <w:rPr>
-          <w:rFonts w:ascii="Consolas" w:eastAsia="Consolas" w:hAnsi="Consolas" w:cs="Consolas"/>
-          <w:sz w:val="18"/>
-          <w:szCs w:val="18"/>
-        </w:rPr>
         <w:br/>
         <w:t>);</w:t>
-      </w:r>
-      <w:r>
-        <w:rPr>
-          <w:rFonts w:ascii="Consolas" w:eastAsia="Consolas" w:hAnsi="Consolas" w:cs="Consolas"/>
-          <w:sz w:val="18"/>
-          <w:szCs w:val="18"/>
-        </w:rPr>
-        <w:br/>
-      </w:r>
-      <w:r>
-        <w:rPr>
-          <w:rFonts w:ascii="Consolas" w:eastAsia="Consolas" w:hAnsi="Consolas" w:cs="Consolas"/>
-          <w:sz w:val="18"/>
-          <w:szCs w:val="18"/>
-        </w:rPr>
+        <w:br/>
         <w:br/>
         <w:t>// Reject — RejectionReason mandatory (BR-04)</w:t>
-      </w:r>
-      <w:r>
-        <w:rPr>
-          <w:rFonts w:ascii="Consolas" w:eastAsia="Consolas" w:hAnsi="Consolas" w:cs="Consolas"/>
-          <w:sz w:val="18"/>
-          <w:szCs w:val="18"/>
-        </w:rPr>
         <w:br/>
         <w:t>If(</w:t>
-      </w:r>
-      <w:r>
-        <w:rPr>
-          <w:rFonts w:ascii="Consolas" w:eastAsia="Consolas" w:hAnsi="Consolas" w:cs="Consolas"/>
-          <w:sz w:val="18"/>
-          <w:szCs w:val="18"/>
-        </w:rPr>
         <w:br/>
         <w:t xml:space="preserve">    IsBlank(txtRejectionReason.Text),</w:t>
-      </w:r>
-      <w:r>
-        <w:rPr>
-          <w:rFonts w:ascii="Consolas" w:eastAsia="Consolas" w:hAnsi="Consolas" w:cs="Consolas"/>
-          <w:sz w:val="18"/>
-          <w:szCs w:val="18"/>
-        </w:rPr>
         <w:br/>
         <w:t xml:space="preserve">    Notify("Please provide a rejection reason before rejecting.", NotificationType.Warning),</w:t>
-      </w:r>
-      <w:r>
-        <w:rPr>
-          <w:rFonts w:ascii="Consolas" w:eastAsia="Consolas" w:hAnsi="Consolas" w:cs="Consolas"/>
-          <w:sz w:val="18"/>
-          <w:szCs w:val="18"/>
-        </w:rPr>
         <w:br/>
         <w:t xml:space="preserve">    Patch(</w:t>
-      </w:r>
-      <w:r>
-        <w:rPr>
-          <w:rFonts w:ascii="Consolas" w:eastAsia="Consolas" w:hAnsi="Consolas" w:cs="Consolas"/>
-          <w:sz w:val="18"/>
-          <w:szCs w:val="18"/>
-        </w:rPr>
         <w:br/>
         <w:t xml:space="preserve">        MonthlyReports,</w:t>
-      </w:r>
-      <w:r>
-        <w:rPr>
-          <w:rFonts w:ascii="Consolas" w:eastAsia="Consolas" w:hAnsi="Consolas" w:cs="Consolas"/>
-          <w:sz w:val="18"/>
-          <w:szCs w:val="18"/>
-        </w:rPr>
         <w:br/>
         <w:t xml:space="preserve">        ThisItem,</w:t>
-      </w:r>
-      <w:r>
-        <w:rPr>
-          <w:rFonts w:ascii="Consolas" w:eastAsia="Consolas" w:hAnsi="Consolas" w:cs="Consolas"/>
-          <w:sz w:val="18"/>
-          <w:szCs w:val="18"/>
-        </w:rPr>
         <w:br/>
         <w:t xml:space="preserve">        {</w:t>
-      </w:r>
-      <w:r>
-        <w:rPr>
-          <w:rFonts w:ascii="Consolas" w:eastAsia="Consolas" w:hAnsi="Consolas" w:cs="Consolas"/>
-          <w:sz w:val="18"/>
-          <w:szCs w:val="18"/>
-        </w:rPr>
         <w:br/>
         <w:t xml:space="preserve">            Status: { Value: "Rejected" },</w:t>
-      </w:r>
-      <w:r>
-        <w:rPr>
-          <w:rFonts w:ascii="Consolas" w:eastAsia="Consolas" w:hAnsi="Consolas" w:cs="Consolas"/>
-          <w:sz w:val="18"/>
-          <w:szCs w:val="18"/>
-        </w:rPr>
         <w:br/>
         <w:t xml:space="preserve">            ReviewedBy: { DisplayName: User().FullName, Email: User().Email },</w:t>
-      </w:r>
-      <w:r>
-        <w:rPr>
-          <w:rFonts w:ascii="Consolas" w:eastAsia="Consolas" w:hAnsi="Consolas" w:cs="Consolas"/>
-          <w:sz w:val="18"/>
-          <w:szCs w:val="18"/>
-        </w:rPr>
         <w:br/>
         <w:t xml:space="preserve">            ReviewDate: Now(),</w:t>
-      </w:r>
-      <w:r>
-        <w:rPr>
-          <w:rFonts w:ascii="Consolas" w:eastAsia="Consolas" w:hAnsi="Consolas" w:cs="Consolas"/>
-          <w:sz w:val="18"/>
-          <w:szCs w:val="18"/>
-        </w:rPr>
-        <w:br/>
-      </w:r>
-      <w:r>
-        <w:rPr>
-          <w:rFonts w:ascii="Consolas" w:eastAsia="Consolas" w:hAnsi="Consolas" w:cs="Consolas"/>
-          <w:sz w:val="18"/>
-          <w:szCs w:val="18"/>
-        </w:rPr>
-        <w:lastRenderedPageBreak/>
+        <w:br/>
         <w:t xml:space="preserve">            RejectionReason: txtRejectionReason.Text</w:t>
-      </w:r>
-      <w:r>
-        <w:rPr>
-          <w:rFonts w:ascii="Consolas" w:eastAsia="Consolas" w:hAnsi="Consolas" w:cs="Consolas"/>
-          <w:sz w:val="18"/>
-          <w:szCs w:val="18"/>
-        </w:rPr>
         <w:br/>
         <w:t xml:space="preserve">        }</w:t>
-      </w:r>
-      <w:r>
-        <w:rPr>
-          <w:rFonts w:ascii="Consolas" w:eastAsia="Consolas" w:hAnsi="Consolas" w:cs="Consolas"/>
-          <w:sz w:val="18"/>
-          <w:szCs w:val="18"/>
-        </w:rPr>
         <w:br/>
         <w:t xml:space="preserve">    )</w:t>
-      </w:r>
-      <w:r>
-        <w:rPr>
-          <w:rFonts w:ascii="Consolas" w:eastAsia="Consolas" w:hAnsi="Consolas" w:cs="Consolas"/>
-          <w:sz w:val="18"/>
-          <w:szCs w:val="18"/>
-        </w:rPr>
         <w:br/>
         <w:t>);</w:t>
       </w:r>
@@ -12368,40 +12541,12 @@
           <w:szCs w:val="18"/>
         </w:rPr>
         <w:t>IsOverdue:</w:t>
-      </w:r>
-      <w:r>
-        <w:rPr>
-          <w:rFonts w:ascii="Consolas" w:eastAsia="Consolas" w:hAnsi="Consolas" w:cs="Consolas"/>
-          <w:sz w:val="18"/>
-          <w:szCs w:val="18"/>
-        </w:rPr>
         <w:br/>
         <w:t>With(</w:t>
-      </w:r>
-      <w:r>
-        <w:rPr>
-          <w:rFonts w:ascii="Consolas" w:eastAsia="Consolas" w:hAnsi="Consolas" w:cs="Consolas"/>
-          <w:sz w:val="18"/>
-          <w:szCs w:val="18"/>
-        </w:rPr>
-        <w:br/>
-        <w:t xml:space="preserve">    { dueThisMonth: Date(Year(Today()), Month(Today()), Activity.DueDayOfMonth) },</w:t>
-      </w:r>
-      <w:r>
-        <w:rPr>
-          <w:rFonts w:ascii="Consolas" w:eastAsia="Consolas" w:hAnsi="Consolas" w:cs="Consolas"/>
-          <w:sz w:val="18"/>
-          <w:szCs w:val="18"/>
-        </w:rPr>
+        <w:br/>
+        <w:t xml:space="preserve">    { dueThisMonth: Date(Year(Today()), Month(Today()), Activity.DueDate) },</w:t>
         <w:br/>
         <w:t xml:space="preserve">    Today() &gt; dueThisMonth &amp;&amp; Status.Value &lt;&gt; "Approved"</w:t>
-      </w:r>
-      <w:r>
-        <w:rPr>
-          <w:rFonts w:ascii="Consolas" w:eastAsia="Consolas" w:hAnsi="Consolas" w:cs="Consolas"/>
-          <w:sz w:val="18"/>
-          <w:szCs w:val="18"/>
-        </w:rPr>
         <w:br/>
         <w:t>)</w:t>
       </w:r>
@@ -13301,7 +13446,7 @@
         <w:spacing w:after="80"/>
       </w:pPr>
       <w:r>
-        <w:t>Validate required fields (PlannedAct, ProgressNarrative) client-side before enabling the Submit button, in addition to any list-level required-field enforcement.</w:t>
+        <w:t>Validate required fields (PlannedAct, Output) client-side before enabling the Submit button, in addition to any list-level required-field enforcement.</w:t>
       </w:r>
     </w:p>
     <w:p>

</xml_diff>